<commit_message>
Complete Johanna Castillo Styku block from source PDF; correct Kelly and Sarah legacy roster entries
</commit_message>
<xml_diff>
--- a/clients/johanna_castillo/Johanna_Castillo_3Day_Training_Plan.docx
+++ b/clients/johanna_castillo/Johanna_Castillo_3Day_Training_Plan.docx
@@ -615,6 +615,616 @@
     <w:p>
       <w:pPr>
         <w:pBdr>
+          <w:bottom w:val="single" w:color="00695C" w:sz="4" w:space="2"/>
+        </w:pBdr>
+        <w:spacing w:after="80" w:before="120"/>
+      </w:pPr>
+      <w:r>
+        <w:rPr>
+          <w:rFonts w:ascii="Arial" w:cs="Arial" w:eastAsia="Arial" w:hAnsi="Arial"/>
+          <w:b/>
+          <w:bCs/>
+          <w:color w:val="00695C"/>
+          <w:sz w:val="17"/>
+          <w:szCs w:val="17"/>
+        </w:rPr>
+        <w:t xml:space="preserve">Styku Body Composition Scan</w:t>
+      </w:r>
+    </w:p>
+    <w:p>
+      <w:pPr>
+        <w:spacing w:after="80"/>
+      </w:pPr>
+      <w:r>
+        <w:rPr>
+          <w:rFonts w:ascii="Arial" w:cs="Arial" w:eastAsia="Arial" w:hAnsi="Arial"/>
+          <w:i/>
+          <w:iCs/>
+          <w:color w:val="6B6B6B"/>
+          <w:sz w:val="14"/>
+          <w:szCs w:val="14"/>
+        </w:rPr>
+        <w:t xml:space="preserve">Scan Date: 8/7/2026</w:t>
+      </w:r>
+    </w:p>
+    <w:tbl>
+      <w:tblPr>
+        <w:tblW w:type="dxa" w:w="10440"/>
+        <w:tblBorders>
+          <w:top w:val="none" w:color="FFFFFF" w:sz="0"/>
+          <w:left w:val="none" w:color="FFFFFF" w:sz="0"/>
+          <w:bottom w:val="none" w:color="FFFFFF" w:sz="0"/>
+          <w:right w:val="none" w:color="FFFFFF" w:sz="0"/>
+          <w:insideH w:val="single" w:color="auto" w:sz="4"/>
+          <w:insideV w:val="single" w:color="auto" w:sz="4"/>
+        </w:tblBorders>
+      </w:tblPr>
+      <w:tblGrid>
+        <w:gridCol w:w="5220"/>
+        <w:gridCol w:w="5220"/>
+      </w:tblGrid>
+      <w:tr>
+        <w:tc>
+          <w:tcPr>
+            <w:tcW w:type="dxa" w:w="5220"/>
+            <w:tcBorders>
+              <w:top w:val="none" w:color="FFFFFF" w:sz="0"/>
+              <w:left w:val="none" w:color="FFFFFF" w:sz="0"/>
+              <w:bottom w:val="none" w:color="FFFFFF" w:sz="0"/>
+              <w:right w:val="none" w:color="FFFFFF" w:sz="0"/>
+            </w:tcBorders>
+            <w:shd w:fill="F0FAFA" w:color="auto" w:val="clear"/>
+            <w:tcMar>
+              <w:top w:type="dxa" w:w="40"/>
+              <w:left w:type="dxa" w:w="80"/>
+              <w:bottom w:type="dxa" w:w="40"/>
+              <w:right w:type="dxa" w:w="80"/>
+            </w:tcMar>
+            <w:vAlign w:val="center"/>
+          </w:tcPr>
+          <w:p>
+            <w:r>
+              <w:rPr>
+                <w:rFonts w:ascii="Arial" w:cs="Arial" w:eastAsia="Arial" w:hAnsi="Arial"/>
+                <w:color w:val="6B6B6B"/>
+                <w:sz w:val="13"/>
+                <w:szCs w:val="13"/>
+              </w:rPr>
+              <w:t xml:space="preserve">Body Fat %</w:t>
+            </w:r>
+          </w:p>
+          <w:p>
+            <w:r>
+              <w:rPr>
+                <w:rFonts w:ascii="Arial" w:cs="Arial" w:eastAsia="Arial" w:hAnsi="Arial"/>
+                <w:b/>
+                <w:bCs/>
+                <w:color w:val="2C2C2C"/>
+                <w:sz w:val="15"/>
+                <w:szCs w:val="15"/>
+              </w:rPr>
+              <w:t xml:space="preserve">40.4% (At-Risk)</w:t>
+            </w:r>
+          </w:p>
+        </w:tc>
+        <w:tc>
+          <w:tcPr>
+            <w:tcW w:type="dxa" w:w="5220"/>
+            <w:tcBorders>
+              <w:top w:val="none" w:color="FFFFFF" w:sz="0"/>
+              <w:left w:val="none" w:color="FFFFFF" w:sz="0"/>
+              <w:bottom w:val="none" w:color="FFFFFF" w:sz="0"/>
+              <w:right w:val="none" w:color="FFFFFF" w:sz="0"/>
+            </w:tcBorders>
+            <w:shd w:fill="F0FAFA" w:color="auto" w:val="clear"/>
+            <w:tcMar>
+              <w:top w:type="dxa" w:w="40"/>
+              <w:left w:type="dxa" w:w="80"/>
+              <w:bottom w:type="dxa" w:w="40"/>
+              <w:right w:type="dxa" w:w="80"/>
+            </w:tcMar>
+            <w:vAlign w:val="center"/>
+          </w:tcPr>
+          <w:p>
+            <w:r>
+              <w:rPr>
+                <w:rFonts w:ascii="Arial" w:cs="Arial" w:eastAsia="Arial" w:hAnsi="Arial"/>
+                <w:color w:val="6B6B6B"/>
+                <w:sz w:val="13"/>
+                <w:szCs w:val="13"/>
+              </w:rPr>
+              <w:t xml:space="preserve">VFA (Visceral Fat)</w:t>
+            </w:r>
+          </w:p>
+          <w:p>
+            <w:r>
+              <w:rPr>
+                <w:rFonts w:ascii="Arial" w:cs="Arial" w:eastAsia="Arial" w:hAnsi="Arial"/>
+                <w:b/>
+                <w:bCs/>
+                <w:color w:val="2C2C2C"/>
+                <w:sz w:val="15"/>
+                <w:szCs w:val="15"/>
+              </w:rPr>
+              <w:t xml:space="preserve">142.7 cm²</w:t>
+            </w:r>
+          </w:p>
+        </w:tc>
+      </w:tr>
+      <w:tr>
+        <w:tc>
+          <w:tcPr>
+            <w:tcW w:type="dxa" w:w="5220"/>
+            <w:tcBorders>
+              <w:top w:val="none" w:color="FFFFFF" w:sz="0"/>
+              <w:left w:val="none" w:color="FFFFFF" w:sz="0"/>
+              <w:bottom w:val="none" w:color="FFFFFF" w:sz="0"/>
+              <w:right w:val="none" w:color="FFFFFF" w:sz="0"/>
+            </w:tcBorders>
+            <w:shd w:fill="FFFFFF" w:color="auto" w:val="clear"/>
+            <w:tcMar>
+              <w:top w:type="dxa" w:w="40"/>
+              <w:left w:type="dxa" w:w="80"/>
+              <w:bottom w:type="dxa" w:w="40"/>
+              <w:right w:type="dxa" w:w="80"/>
+            </w:tcMar>
+            <w:vAlign w:val="center"/>
+          </w:tcPr>
+          <w:p>
+            <w:r>
+              <w:rPr>
+                <w:rFonts w:ascii="Arial" w:cs="Arial" w:eastAsia="Arial" w:hAnsi="Arial"/>
+                <w:color w:val="6B6B6B"/>
+                <w:sz w:val="13"/>
+                <w:szCs w:val="13"/>
+              </w:rPr>
+              <w:t xml:space="preserve">Lean Mass</w:t>
+            </w:r>
+          </w:p>
+          <w:p>
+            <w:r>
+              <w:rPr>
+                <w:rFonts w:ascii="Arial" w:cs="Arial" w:eastAsia="Arial" w:hAnsi="Arial"/>
+                <w:b/>
+                <w:bCs/>
+                <w:color w:val="2C2C2C"/>
+                <w:sz w:val="15"/>
+                <w:szCs w:val="15"/>
+              </w:rPr>
+              <w:t xml:space="preserve">97.7 lbs (56.9%)</w:t>
+            </w:r>
+          </w:p>
+        </w:tc>
+        <w:tc>
+          <w:tcPr>
+            <w:tcW w:type="dxa" w:w="5220"/>
+            <w:tcBorders>
+              <w:top w:val="none" w:color="FFFFFF" w:sz="0"/>
+              <w:left w:val="none" w:color="FFFFFF" w:sz="0"/>
+              <w:bottom w:val="none" w:color="FFFFFF" w:sz="0"/>
+              <w:right w:val="none" w:color="FFFFFF" w:sz="0"/>
+            </w:tcBorders>
+            <w:shd w:fill="FFFFFF" w:color="auto" w:val="clear"/>
+            <w:tcMar>
+              <w:top w:type="dxa" w:w="40"/>
+              <w:left w:type="dxa" w:w="80"/>
+              <w:bottom w:type="dxa" w:w="40"/>
+              <w:right w:type="dxa" w:w="80"/>
+            </w:tcMar>
+            <w:vAlign w:val="center"/>
+          </w:tcPr>
+          <w:p>
+            <w:r>
+              <w:rPr>
+                <w:rFonts w:ascii="Arial" w:cs="Arial" w:eastAsia="Arial" w:hAnsi="Arial"/>
+                <w:color w:val="6B6B6B"/>
+                <w:sz w:val="13"/>
+                <w:szCs w:val="13"/>
+              </w:rPr>
+              <w:t xml:space="preserve">Shape Score</w:t>
+            </w:r>
+          </w:p>
+          <w:p>
+            <w:r>
+              <w:rPr>
+                <w:rFonts w:ascii="Arial" w:cs="Arial" w:eastAsia="Arial" w:hAnsi="Arial"/>
+                <w:b/>
+                <w:bCs/>
+                <w:color w:val="2C2C2C"/>
+                <w:sz w:val="15"/>
+                <w:szCs w:val="15"/>
+              </w:rPr>
+              <w:t xml:space="preserve">54/100 — Needs Improvement</w:t>
+            </w:r>
+          </w:p>
+        </w:tc>
+      </w:tr>
+      <w:tr>
+        <w:tc>
+          <w:tcPr>
+            <w:tcW w:type="dxa" w:w="5220"/>
+            <w:tcBorders>
+              <w:top w:val="none" w:color="FFFFFF" w:sz="0"/>
+              <w:left w:val="none" w:color="FFFFFF" w:sz="0"/>
+              <w:bottom w:val="none" w:color="FFFFFF" w:sz="0"/>
+              <w:right w:val="none" w:color="FFFFFF" w:sz="0"/>
+            </w:tcBorders>
+            <w:shd w:fill="F0FAFA" w:color="auto" w:val="clear"/>
+            <w:tcMar>
+              <w:top w:type="dxa" w:w="40"/>
+              <w:left w:type="dxa" w:w="80"/>
+              <w:bottom w:type="dxa" w:w="40"/>
+              <w:right w:type="dxa" w:w="80"/>
+            </w:tcMar>
+            <w:vAlign w:val="center"/>
+          </w:tcPr>
+          <w:p>
+            <w:r>
+              <w:rPr>
+                <w:rFonts w:ascii="Arial" w:cs="Arial" w:eastAsia="Arial" w:hAnsi="Arial"/>
+                <w:color w:val="6B6B6B"/>
+                <w:sz w:val="13"/>
+                <w:szCs w:val="13"/>
+              </w:rPr>
+              <w:t xml:space="preserve">Fat Mass</w:t>
+            </w:r>
+          </w:p>
+          <w:p>
+            <w:r>
+              <w:rPr>
+                <w:rFonts w:ascii="Arial" w:cs="Arial" w:eastAsia="Arial" w:hAnsi="Arial"/>
+                <w:b/>
+                <w:bCs/>
+                <w:color w:val="2C2C2C"/>
+                <w:sz w:val="15"/>
+                <w:szCs w:val="15"/>
+              </w:rPr>
+              <w:t xml:space="preserve">69.4 lbs</w:t>
+            </w:r>
+          </w:p>
+        </w:tc>
+        <w:tc>
+          <w:tcPr>
+            <w:tcW w:type="dxa" w:w="5220"/>
+            <w:tcBorders>
+              <w:top w:val="none" w:color="FFFFFF" w:sz="0"/>
+              <w:left w:val="none" w:color="FFFFFF" w:sz="0"/>
+              <w:bottom w:val="none" w:color="FFFFFF" w:sz="0"/>
+              <w:right w:val="none" w:color="FFFFFF" w:sz="0"/>
+            </w:tcBorders>
+            <w:shd w:fill="F0FAFA" w:color="auto" w:val="clear"/>
+            <w:tcMar>
+              <w:top w:type="dxa" w:w="40"/>
+              <w:left w:type="dxa" w:w="80"/>
+              <w:bottom w:type="dxa" w:w="40"/>
+              <w:right w:type="dxa" w:w="80"/>
+            </w:tcMar>
+            <w:vAlign w:val="center"/>
+          </w:tcPr>
+          <w:p>
+            <w:r>
+              <w:rPr>
+                <w:rFonts w:ascii="Arial" w:cs="Arial" w:eastAsia="Arial" w:hAnsi="Arial"/>
+                <w:color w:val="6B6B6B"/>
+                <w:sz w:val="13"/>
+                <w:szCs w:val="13"/>
+              </w:rPr>
+              <w:t xml:space="preserve">ALST Index</w:t>
+            </w:r>
+          </w:p>
+          <w:p>
+            <w:r>
+              <w:rPr>
+                <w:rFonts w:ascii="Arial" w:cs="Arial" w:eastAsia="Arial" w:hAnsi="Arial"/>
+                <w:b/>
+                <w:bCs/>
+                <w:color w:val="2C2C2C"/>
+                <w:sz w:val="15"/>
+                <w:szCs w:val="15"/>
+              </w:rPr>
+              <w:t xml:space="preserve">7.23 kg/m²</w:t>
+            </w:r>
+          </w:p>
+        </w:tc>
+      </w:tr>
+      <w:tr>
+        <w:tc>
+          <w:tcPr>
+            <w:tcW w:type="dxa" w:w="5220"/>
+            <w:tcBorders>
+              <w:top w:val="none" w:color="FFFFFF" w:sz="0"/>
+              <w:left w:val="none" w:color="FFFFFF" w:sz="0"/>
+              <w:bottom w:val="none" w:color="FFFFFF" w:sz="0"/>
+              <w:right w:val="none" w:color="FFFFFF" w:sz="0"/>
+            </w:tcBorders>
+            <w:shd w:fill="FFFFFF" w:color="auto" w:val="clear"/>
+            <w:tcMar>
+              <w:top w:type="dxa" w:w="40"/>
+              <w:left w:type="dxa" w:w="80"/>
+              <w:bottom w:type="dxa" w:w="40"/>
+              <w:right w:type="dxa" w:w="80"/>
+            </w:tcMar>
+            <w:vAlign w:val="center"/>
+          </w:tcPr>
+          <w:p>
+            <w:r>
+              <w:rPr>
+                <w:rFonts w:ascii="Arial" w:cs="Arial" w:eastAsia="Arial" w:hAnsi="Arial"/>
+                <w:color w:val="6B6B6B"/>
+                <w:sz w:val="13"/>
+                <w:szCs w:val="13"/>
+              </w:rPr>
+              <w:t xml:space="preserve">Bone Mass (Styku est.)</w:t>
+            </w:r>
+          </w:p>
+          <w:p>
+            <w:r>
+              <w:rPr>
+                <w:rFonts w:ascii="Arial" w:cs="Arial" w:eastAsia="Arial" w:hAnsi="Arial"/>
+                <w:b/>
+                <w:bCs/>
+                <w:color w:val="2C2C2C"/>
+                <w:sz w:val="15"/>
+                <w:szCs w:val="15"/>
+              </w:rPr>
+              <w:t xml:space="preserve">4.7 lbs</w:t>
+            </w:r>
+          </w:p>
+        </w:tc>
+        <w:tc>
+          <w:tcPr>
+            <w:tcW w:type="dxa" w:w="5220"/>
+            <w:tcBorders>
+              <w:top w:val="none" w:color="FFFFFF" w:sz="0"/>
+              <w:left w:val="none" w:color="FFFFFF" w:sz="0"/>
+              <w:bottom w:val="none" w:color="FFFFFF" w:sz="0"/>
+              <w:right w:val="none" w:color="FFFFFF" w:sz="0"/>
+            </w:tcBorders>
+            <w:shd w:fill="FFFFFF" w:color="auto" w:val="clear"/>
+            <w:tcMar>
+              <w:top w:type="dxa" w:w="40"/>
+              <w:left w:type="dxa" w:w="80"/>
+              <w:bottom w:type="dxa" w:w="40"/>
+              <w:right w:type="dxa" w:w="80"/>
+            </w:tcMar>
+            <w:vAlign w:val="center"/>
+          </w:tcPr>
+          <w:p>
+            <w:r>
+              <w:rPr>
+                <w:rFonts w:ascii="Arial" w:cs="Arial" w:eastAsia="Arial" w:hAnsi="Arial"/>
+                <w:color w:val="6B6B6B"/>
+                <w:sz w:val="13"/>
+                <w:szCs w:val="13"/>
+              </w:rPr>
+              <w:t xml:space="preserve">Left Arm LST</w:t>
+            </w:r>
+          </w:p>
+          <w:p>
+            <w:r>
+              <w:rPr>
+                <w:rFonts w:ascii="Arial" w:cs="Arial" w:eastAsia="Arial" w:hAnsi="Arial"/>
+                <w:b/>
+                <w:bCs/>
+                <w:color w:val="2C2C2C"/>
+                <w:sz w:val="15"/>
+                <w:szCs w:val="15"/>
+              </w:rPr>
+              <w:t xml:space="preserve">8.7 lbs</w:t>
+            </w:r>
+          </w:p>
+        </w:tc>
+      </w:tr>
+      <w:tr>
+        <w:tc>
+          <w:tcPr>
+            <w:tcW w:type="dxa" w:w="5220"/>
+            <w:tcBorders>
+              <w:top w:val="none" w:color="FFFFFF" w:sz="0"/>
+              <w:left w:val="none" w:color="FFFFFF" w:sz="0"/>
+              <w:bottom w:val="none" w:color="FFFFFF" w:sz="0"/>
+              <w:right w:val="none" w:color="FFFFFF" w:sz="0"/>
+            </w:tcBorders>
+            <w:shd w:fill="F0FAFA" w:color="auto" w:val="clear"/>
+            <w:tcMar>
+              <w:top w:type="dxa" w:w="40"/>
+              <w:left w:type="dxa" w:w="80"/>
+              <w:bottom w:type="dxa" w:w="40"/>
+              <w:right w:type="dxa" w:w="80"/>
+            </w:tcMar>
+            <w:vAlign w:val="center"/>
+          </w:tcPr>
+          <w:p>
+            <w:r>
+              <w:rPr>
+                <w:rFonts w:ascii="Arial" w:cs="Arial" w:eastAsia="Arial" w:hAnsi="Arial"/>
+                <w:color w:val="6B6B6B"/>
+                <w:sz w:val="13"/>
+                <w:szCs w:val="13"/>
+              </w:rPr>
+              <w:t xml:space="preserve">BMI</w:t>
+            </w:r>
+          </w:p>
+          <w:p>
+            <w:r>
+              <w:rPr>
+                <w:rFonts w:ascii="Arial" w:cs="Arial" w:eastAsia="Arial" w:hAnsi="Arial"/>
+                <w:b/>
+                <w:bCs/>
+                <w:color w:val="2C2C2C"/>
+                <w:sz w:val="15"/>
+                <w:szCs w:val="15"/>
+              </w:rPr>
+              <w:t xml:space="preserve">29.5</w:t>
+            </w:r>
+          </w:p>
+        </w:tc>
+        <w:tc>
+          <w:tcPr>
+            <w:tcW w:type="dxa" w:w="5220"/>
+            <w:tcBorders>
+              <w:top w:val="none" w:color="FFFFFF" w:sz="0"/>
+              <w:left w:val="none" w:color="FFFFFF" w:sz="0"/>
+              <w:bottom w:val="none" w:color="FFFFFF" w:sz="0"/>
+              <w:right w:val="none" w:color="FFFFFF" w:sz="0"/>
+            </w:tcBorders>
+            <w:shd w:fill="F0FAFA" w:color="auto" w:val="clear"/>
+            <w:tcMar>
+              <w:top w:type="dxa" w:w="40"/>
+              <w:left w:type="dxa" w:w="80"/>
+              <w:bottom w:type="dxa" w:w="40"/>
+              <w:right w:type="dxa" w:w="80"/>
+            </w:tcMar>
+            <w:vAlign w:val="center"/>
+          </w:tcPr>
+          <w:p>
+            <w:r>
+              <w:rPr>
+                <w:rFonts w:ascii="Arial" w:cs="Arial" w:eastAsia="Arial" w:hAnsi="Arial"/>
+                <w:color w:val="6B6B6B"/>
+                <w:sz w:val="13"/>
+                <w:szCs w:val="13"/>
+              </w:rPr>
+              <w:t xml:space="preserve">Right Arm LST</w:t>
+            </w:r>
+          </w:p>
+          <w:p>
+            <w:r>
+              <w:rPr>
+                <w:rFonts w:ascii="Arial" w:cs="Arial" w:eastAsia="Arial" w:hAnsi="Arial"/>
+                <w:b/>
+                <w:bCs/>
+                <w:color w:val="2C2C2C"/>
+                <w:sz w:val="15"/>
+                <w:szCs w:val="15"/>
+              </w:rPr>
+              <w:t xml:space="preserve">8.4 lbs</w:t>
+            </w:r>
+          </w:p>
+        </w:tc>
+      </w:tr>
+      <w:tr>
+        <w:tc>
+          <w:tcPr>
+            <w:tcW w:type="dxa" w:w="5220"/>
+            <w:tcBorders>
+              <w:top w:val="none" w:color="FFFFFF" w:sz="0"/>
+              <w:left w:val="none" w:color="FFFFFF" w:sz="0"/>
+              <w:bottom w:val="none" w:color="FFFFFF" w:sz="0"/>
+              <w:right w:val="none" w:color="FFFFFF" w:sz="0"/>
+            </w:tcBorders>
+            <w:shd w:fill="FFFFFF" w:color="auto" w:val="clear"/>
+            <w:tcMar>
+              <w:top w:type="dxa" w:w="40"/>
+              <w:left w:type="dxa" w:w="80"/>
+              <w:bottom w:type="dxa" w:w="40"/>
+              <w:right w:type="dxa" w:w="80"/>
+            </w:tcMar>
+            <w:vAlign w:val="center"/>
+          </w:tcPr>
+          <w:p>
+            <w:r>
+              <w:rPr>
+                <w:rFonts w:ascii="Arial" w:cs="Arial" w:eastAsia="Arial" w:hAnsi="Arial"/>
+                <w:color w:val="6B6B6B"/>
+                <w:sz w:val="13"/>
+                <w:szCs w:val="13"/>
+              </w:rPr>
+              <w:t xml:space="preserve">BMR</w:t>
+            </w:r>
+          </w:p>
+          <w:p>
+            <w:r>
+              <w:rPr>
+                <w:rFonts w:ascii="Arial" w:cs="Arial" w:eastAsia="Arial" w:hAnsi="Arial"/>
+                <w:b/>
+                <w:bCs/>
+                <w:color w:val="2C2C2C"/>
+                <w:sz w:val="15"/>
+                <w:szCs w:val="15"/>
+              </w:rPr>
+              <w:t xml:space="preserve">1451 cal/day</w:t>
+            </w:r>
+          </w:p>
+        </w:tc>
+        <w:tc>
+          <w:tcPr>
+            <w:tcW w:type="dxa" w:w="5220"/>
+            <w:tcBorders>
+              <w:top w:val="none" w:color="FFFFFF" w:sz="0"/>
+              <w:left w:val="none" w:color="FFFFFF" w:sz="0"/>
+              <w:bottom w:val="none" w:color="FFFFFF" w:sz="0"/>
+              <w:right w:val="none" w:color="FFFFFF" w:sz="0"/>
+            </w:tcBorders>
+            <w:shd w:fill="FFFFFF" w:color="auto" w:val="clear"/>
+            <w:tcMar>
+              <w:top w:type="dxa" w:w="40"/>
+              <w:left w:type="dxa" w:w="80"/>
+              <w:bottom w:type="dxa" w:w="40"/>
+              <w:right w:type="dxa" w:w="80"/>
+            </w:tcMar>
+            <w:vAlign w:val="center"/>
+          </w:tcPr>
+          <w:p>
+            <w:r>
+              <w:rPr>
+                <w:rFonts w:ascii="Arial" w:cs="Arial" w:eastAsia="Arial" w:hAnsi="Arial"/>
+                <w:color w:val="6B6B6B"/>
+                <w:sz w:val="13"/>
+                <w:szCs w:val="13"/>
+              </w:rPr>
+              <w:t xml:space="preserve">Left / Right Leg LST</w:t>
+            </w:r>
+          </w:p>
+          <w:p>
+            <w:r>
+              <w:rPr>
+                <w:rFonts w:ascii="Arial" w:cs="Arial" w:eastAsia="Arial" w:hAnsi="Arial"/>
+                <w:b/>
+                <w:bCs/>
+                <w:color w:val="2C2C2C"/>
+                <w:sz w:val="15"/>
+                <w:szCs w:val="15"/>
+              </w:rPr>
+              <w:t xml:space="preserve">17.5 / 18 lbs</w:t>
+            </w:r>
+          </w:p>
+        </w:tc>
+      </w:tr>
+    </w:tbl>
+    <w:p>
+      <w:pPr>
+        <w:spacing w:after="100"/>
+      </w:pPr>
+    </w:p>
+    <w:p>
+      <w:pPr>
+        <w:spacing w:after="100"/>
+      </w:pPr>
+      <w:r>
+        <w:rPr>
+          <w:rFonts w:ascii="Arial" w:cs="Arial" w:eastAsia="Arial" w:hAnsi="Arial"/>
+          <w:b/>
+          <w:bCs/>
+          <w:color w:val="00695C"/>
+          <w:sz w:val="17"/>
+          <w:szCs w:val="17"/>
+        </w:rPr>
+        <w:t xml:space="preserve">Peer Comparison:  </w:t>
+      </w:r>
+      <w:r>
+        <w:rPr>
+          <w:rFonts w:ascii="Arial" w:cs="Arial" w:eastAsia="Arial" w:hAnsi="Arial"/>
+          <w:color w:val="2C2C2C"/>
+          <w:sz w:val="17"/>
+          <w:szCs w:val="17"/>
+        </w:rPr>
+        <w:t xml:space="preserve">Lower body fat than 20% of your peers</w:t>
+      </w:r>
+    </w:p>
+    <w:p>
+      <w:pPr>
+        <w:pBdr>
           <w:bottom w:val="single" w:color="C9A227" w:sz="4" w:space="2"/>
         </w:pBdr>
         <w:spacing w:after="80" w:before="120"/>
@@ -1364,75 +1974,6 @@
       <w:pPr>
         <w:spacing w:after="100"/>
       </w:pPr>
-    </w:p>
-    <w:p>
-      <w:pPr>
-        <w:pBdr>
-          <w:bottom w:val="single" w:color="00695C" w:sz="4" w:space="2"/>
-        </w:pBdr>
-        <w:spacing w:after="80" w:before="120"/>
-      </w:pPr>
-      <w:r>
-        <w:rPr>
-          <w:rFonts w:ascii="Arial" w:cs="Arial" w:eastAsia="Arial" w:hAnsi="Arial"/>
-          <w:b/>
-          <w:bCs/>
-          <w:color w:val="00695C"/>
-          <w:sz w:val="17"/>
-          <w:szCs w:val="17"/>
-        </w:rPr>
-        <w:t xml:space="preserve">Styku Body Composition Scan</w:t>
-      </w:r>
-    </w:p>
-    <w:p>
-      <w:pPr>
-        <w:spacing w:after="100"/>
-      </w:pPr>
-      <w:r>
-        <w:rPr>
-          <w:rFonts w:ascii="Arial" w:cs="Arial" w:eastAsia="Arial" w:hAnsi="Arial"/>
-          <w:b/>
-          <w:bCs/>
-          <w:color w:val="00695C"/>
-          <w:sz w:val="17"/>
-          <w:szCs w:val="17"/>
-        </w:rPr>
-        <w:t xml:space="preserve">Scan Values on Record:  </w:t>
-      </w:r>
-      <w:r>
-        <w:rPr>
-          <w:rFonts w:ascii="Arial" w:cs="Arial" w:eastAsia="Arial" w:hAnsi="Arial"/>
-          <w:color w:val="2C2C2C"/>
-          <w:sz w:val="17"/>
-          <w:szCs w:val="17"/>
-        </w:rPr>
-        <w:t xml:space="preserve">Body Fat 40.4% (Styku's own At-Risk classification) · ALST Index 7.23 kg/m² · Visceral Fat Area 142.7 cm² · Segmental lean soft tissue — Left Arm 8.7 lbs / Right Arm 8.4 lbs, Left Leg 17.5 lbs / Right Leg 18.0 lbs. These are the figures every clinical note in this document is built from: the fat-loss and cardiometabolic emphasis, the conditioning finisher on each training day, and the per-side logging on unilateral work all trace back to them.</w:t>
-      </w:r>
-    </w:p>
-    <w:p>
-      <w:pPr>
-        <w:spacing w:after="100"/>
-      </w:pPr>
-      <w:r>
-        <w:rPr>
-          <w:rFonts w:ascii="Arial" w:cs="Arial" w:eastAsia="Arial" w:hAnsi="Arial"/>
-          <w:b/>
-          <w:bCs/>
-          <w:color w:val="E65100"/>
-          <w:sz w:val="17"/>
-          <w:szCs w:val="17"/>
-        </w:rPr>
-        <w:t xml:space="preserve">Styku Record — Fields Not on File:  </w:t>
-      </w:r>
-      <w:r>
-        <w:rPr>
-          <w:rFonts w:ascii="Arial" w:cs="Arial" w:eastAsia="Arial" w:hAnsi="Arial"/>
-          <w:color w:val="2C2C2C"/>
-          <w:sz w:val="17"/>
-          <w:szCs w:val="17"/>
-        </w:rPr>
-        <w:t xml:space="preserve">Her record carries body fat %, ALST Index, VFA, and the full segmental LST set, but NOT Lean Mass, Lean Mass %, Fat Mass, Bone Mass, BMI, BMR, Shape Score, or the scan date — which is why this document renders a values-on-record section instead of the standard eight-field Styku table used for every other scanned client on the roster. Nothing was derived or estimated to fill those gaps (her documented 5'4" / 172 lbs would yield a BMI near 29.5, but Styku's own reported BMI is not on file and no inferred figure has been placed into a scan table). Request the missing fields from her source Styku PDF; once supplied, swap this section for a standard `stykuBlock()` call in the build script.</w:t>
-      </w:r>
     </w:p>
     <w:p>
       <w:pPr>
@@ -1522,7 +2063,7 @@
           <w:sz w:val="17"/>
           <w:szCs w:val="17"/>
         </w:rPr>
-        <w:t xml:space="preserve">Body Fat 40.4% At-Risk:  </w:t>
+        <w:t xml:space="preserve">Body Fat 40.4% — Styku Body-Fat Rank At-Risk:  </w:t>
       </w:r>
       <w:r>
         <w:rPr>
@@ -1531,7 +2072,7 @@
           <w:sz w:val="17"/>
           <w:szCs w:val="17"/>
         </w:rPr>
-        <w:t xml:space="preserve">Tracked alongside VFA as the cardiometabolic/fat-loss priority for this block. Reassess at the 8-week Styku rescan.</w:t>
+        <w:t xml:space="preserve">This is Styku's own body-fat ranking, a body-composition figure — separate from the ALST lean-mass reading above, which is within normal reference range. Tracked alongside VFA as the cardiometabolic/fat-loss priority for this block, which is what the conditioning finisher on each training day is built for. Her BMI reads 29.5, in the standard overweight band and just under the 30 cutoff; read it alongside body composition rather than on its own. Reassess all three at the 8-week Styku rescan.</w:t>
       </w:r>
     </w:p>
     <w:p>

</xml_diff>